<commit_message>
Epic 4E.4: Apply Aktiv Grotesk font to all PPTX and DOCX templates
Replaces Calibri, Calibri Light, Arial, Helvetica, Trebuchet MS, Segoe UI
with Aktiv Grotesk across 13 PPTX files and 5 DOCX files via ZIP-level XML
patching (theme, slide masters, layouts, individual slides, styles, body).

- 13 PPTX files: 21,773 font attribute replacements total
- 5 DOCX files: 318 font attribute replacements total
- New script: tools/apply_aktiv_grotesk_font.py (re-runnable, idempotent)

Co-Authored-By: Claude Sonnet 4.6 <noreply@anthropic.com>
</commit_message>
<xml_diff>
--- a/Templates/04-planning/governance-workshop-schedule.docx
+++ b/Templates/04-planning/governance-workshop-schedule.docx
@@ -746,14 +746,14 @@
             <w:pPr>
               <w:jc w:val="center"/>
               <w:rPr>
-                <w:rFonts w:ascii="Calibri" w:hAnsi="Calibri"/>
+                <w:rFonts w:ascii="Aktiv Grotesk" w:hAnsi="Aktiv Grotesk"/>
                 <w:sz w:val="28"/>
                 <w:szCs w:val="28"/>
               </w:rPr>
             </w:pPr>
             <w:r>
               <w:rPr>
-                <w:rFonts w:ascii="Calibri" w:hAnsi="Calibri"/>
+                <w:rFonts w:ascii="Aktiv Grotesk" w:hAnsi="Aktiv Grotesk"/>
                 <w:b/>
                 <w:bCs/>
                 <w:i/>
@@ -766,7 +766,7 @@
             <w:proofErr w:type="spellStart"/>
             <w:r>
               <w:rPr>
-                <w:rFonts w:ascii="Calibri" w:hAnsi="Calibri"/>
+                <w:rFonts w:ascii="Aktiv Grotesk" w:hAnsi="Aktiv Grotesk"/>
                 <w:b/>
                 <w:bCs/>
                 <w:i/>
@@ -779,7 +779,7 @@
             <w:proofErr w:type="spellEnd"/>
             <w:r>
               <w:rPr>
-                <w:rFonts w:ascii="Calibri" w:hAnsi="Calibri"/>
+                <w:rFonts w:ascii="Aktiv Grotesk" w:hAnsi="Aktiv Grotesk"/>
                 <w:b/>
                 <w:bCs/>
                 <w:i/>
@@ -791,7 +791,7 @@
             </w:r>
             <w:r>
               <w:rPr>
-                <w:rFonts w:ascii="Calibri" w:hAnsi="Calibri"/>
+                <w:rFonts w:ascii="Aktiv Grotesk" w:hAnsi="Aktiv Grotesk"/>
                 <w:b/>
                 <w:bCs/>
                 <w:i/>
@@ -803,7 +803,7 @@
             </w:r>
             <w:r>
               <w:rPr>
-                <w:rFonts w:ascii="Calibri" w:hAnsi="Calibri"/>
+                <w:rFonts w:ascii="Aktiv Grotesk" w:hAnsi="Aktiv Grotesk"/>
                 <w:b/>
                 <w:bCs/>
                 <w:i/>
@@ -1139,7 +1139,7 @@
             </w:pPr>
             <w:r>
               <w:rPr>
-                <w:rFonts w:ascii="Calibri" w:hAnsi="Calibri"/>
+                <w:rFonts w:ascii="Aktiv Grotesk" w:hAnsi="Aktiv Grotesk"/>
                 <w:b/>
                 <w:bCs/>
                 <w:i/>
@@ -1151,7 +1151,7 @@
             </w:r>
             <w:r>
               <w:rPr>
-                <w:rFonts w:ascii="Calibri" w:hAnsi="Calibri"/>
+                <w:rFonts w:ascii="Aktiv Grotesk" w:hAnsi="Aktiv Grotesk"/>
                 <w:b/>
                 <w:bCs/>
                 <w:i/>
@@ -1181,7 +1181,7 @@
             </w:pPr>
             <w:r>
               <w:rPr>
-                <w:rFonts w:eastAsia="Calibri" w:cs="Calibri"/>
+                <w:rFonts w:eastAsia="Aktiv Grotesk" w:cs="Aktiv Grotesk"/>
                 <w:b/>
                 <w:bCs/>
                 <w:sz w:val="20"/>
@@ -1191,7 +1191,7 @@
             </w:r>
             <w:r>
               <w:rPr>
-                <w:rFonts w:eastAsia="Calibri" w:cs="Calibri"/>
+                <w:rFonts w:eastAsia="Aktiv Grotesk" w:cs="Aktiv Grotesk"/>
                 <w:b/>
                 <w:bCs/>
                 <w:sz w:val="20"/>
@@ -1201,7 +1201,7 @@
             </w:r>
             <w:r>
               <w:rPr>
-                <w:rFonts w:eastAsia="Calibri" w:cs="Calibri"/>
+                <w:rFonts w:eastAsia="Aktiv Grotesk" w:cs="Aktiv Grotesk"/>
                 <w:b/>
                 <w:bCs/>
                 <w:sz w:val="20"/>
@@ -1211,7 +1211,7 @@
             </w:r>
             <w:r>
               <w:rPr>
-                <w:rFonts w:eastAsia="Calibri" w:cs="Calibri"/>
+                <w:rFonts w:eastAsia="Aktiv Grotesk" w:cs="Aktiv Grotesk"/>
                 <w:b/>
                 <w:bCs/>
                 <w:sz w:val="20"/>
@@ -1221,7 +1221,7 @@
             </w:r>
             <w:r>
               <w:rPr>
-                <w:rFonts w:eastAsia="Calibri" w:cs="Calibri"/>
+                <w:rFonts w:eastAsia="Aktiv Grotesk" w:cs="Aktiv Grotesk"/>
                 <w:b/>
                 <w:bCs/>
                 <w:sz w:val="20"/>
@@ -1231,7 +1231,7 @@
             </w:r>
             <w:r>
               <w:rPr>
-                <w:rFonts w:eastAsia="Calibri" w:cs="Calibri"/>
+                <w:rFonts w:eastAsia="Aktiv Grotesk" w:cs="Aktiv Grotesk"/>
                 <w:b/>
                 <w:bCs/>
                 <w:sz w:val="20"/>
@@ -1384,7 +1384,7 @@
               </w:numPr>
               <w:spacing w:after="160" w:line="259" w:lineRule="auto"/>
               <w:rPr>
-                <w:rFonts w:eastAsia="Times New Roman" w:cs="Calibri"/>
+                <w:rFonts w:eastAsia="Times New Roman" w:cs="Aktiv Grotesk"/>
                 <w:b/>
                 <w:bCs/>
               </w:rPr>
@@ -1506,7 +1506,7 @@
             <w:pPr>
               <w:jc w:val="center"/>
               <w:rPr>
-                <w:rFonts w:ascii="Calibri" w:hAnsi="Calibri"/>
+                <w:rFonts w:ascii="Aktiv Grotesk" w:hAnsi="Aktiv Grotesk"/>
                 <w:b/>
                 <w:bCs/>
                 <w:i/>
@@ -1518,7 +1518,7 @@
             <w:bookmarkStart w:id="0" w:name="_Hlk124757188"/>
             <w:r>
               <w:rPr>
-                <w:rFonts w:ascii="Calibri" w:hAnsi="Calibri"/>
+                <w:rFonts w:ascii="Aktiv Grotesk" w:hAnsi="Aktiv Grotesk"/>
                 <w:b/>
                 <w:bCs/>
                 <w:i/>
@@ -1530,7 +1530,7 @@
             </w:r>
             <w:r>
               <w:rPr>
-                <w:rFonts w:ascii="Calibri" w:hAnsi="Calibri"/>
+                <w:rFonts w:ascii="Aktiv Grotesk" w:hAnsi="Aktiv Grotesk"/>
                 <w:b/>
                 <w:bCs/>
                 <w:i/>
@@ -1542,7 +1542,7 @@
             </w:r>
             <w:r>
               <w:rPr>
-                <w:rFonts w:ascii="Calibri" w:hAnsi="Calibri"/>
+                <w:rFonts w:ascii="Aktiv Grotesk" w:hAnsi="Aktiv Grotesk"/>
                 <w:b/>
                 <w:bCs/>
                 <w:i/>
@@ -1554,7 +1554,7 @@
             </w:r>
             <w:r>
               <w:rPr>
-                <w:rFonts w:ascii="Calibri" w:hAnsi="Calibri"/>
+                <w:rFonts w:ascii="Aktiv Grotesk" w:hAnsi="Aktiv Grotesk"/>
                 <w:b/>
                 <w:bCs/>
                 <w:i/>
@@ -1566,7 +1566,7 @@
             </w:r>
             <w:r>
               <w:rPr>
-                <w:rFonts w:ascii="Calibri" w:hAnsi="Calibri"/>
+                <w:rFonts w:ascii="Aktiv Grotesk" w:hAnsi="Aktiv Grotesk"/>
                 <w:b/>
                 <w:bCs/>
                 <w:i/>
@@ -1600,7 +1600,7 @@
             </w:pPr>
             <w:r>
               <w:rPr>
-                <w:rFonts w:eastAsia="Calibri" w:cs="Calibri"/>
+                <w:rFonts w:eastAsia="Aktiv Grotesk" w:cs="Aktiv Grotesk"/>
                 <w:b/>
                 <w:bCs/>
                 <w:sz w:val="20"/>
@@ -1610,7 +1610,7 @@
             </w:r>
             <w:r>
               <w:rPr>
-                <w:rFonts w:eastAsia="Calibri" w:cs="Calibri"/>
+                <w:rFonts w:eastAsia="Aktiv Grotesk" w:cs="Aktiv Grotesk"/>
                 <w:b/>
                 <w:bCs/>
                 <w:sz w:val="20"/>
@@ -1620,7 +1620,7 @@
             </w:r>
             <w:r>
               <w:rPr>
-                <w:rFonts w:eastAsia="Calibri" w:cs="Calibri"/>
+                <w:rFonts w:eastAsia="Aktiv Grotesk" w:cs="Aktiv Grotesk"/>
                 <w:b/>
                 <w:bCs/>
                 <w:sz w:val="20"/>
@@ -1630,7 +1630,7 @@
             </w:r>
             <w:r>
               <w:rPr>
-                <w:rFonts w:eastAsia="Calibri" w:cs="Calibri"/>
+                <w:rFonts w:eastAsia="Aktiv Grotesk" w:cs="Aktiv Grotesk"/>
                 <w:b/>
                 <w:bCs/>
                 <w:sz w:val="20"/>
@@ -1641,7 +1641,7 @@
             <w:proofErr w:type="spellStart"/>
             <w:r>
               <w:rPr>
-                <w:rFonts w:eastAsia="Calibri" w:cs="Calibri"/>
+                <w:rFonts w:eastAsia="Aktiv Grotesk" w:cs="Aktiv Grotesk"/>
                 <w:b/>
                 <w:bCs/>
                 <w:sz w:val="20"/>
@@ -1896,7 +1896,7 @@
             <w:pPr>
               <w:jc w:val="center"/>
               <w:rPr>
-                <w:rFonts w:ascii="Calibri" w:hAnsi="Calibri"/>
+                <w:rFonts w:ascii="Aktiv Grotesk" w:hAnsi="Aktiv Grotesk"/>
                 <w:b/>
                 <w:bCs/>
                 <w:i/>
@@ -1908,7 +1908,7 @@
             <w:bookmarkStart w:id="1" w:name="_Hlk124757432"/>
             <w:r>
               <w:rPr>
-                <w:rFonts w:ascii="Calibri" w:hAnsi="Calibri"/>
+                <w:rFonts w:ascii="Aktiv Grotesk" w:hAnsi="Aktiv Grotesk"/>
                 <w:b/>
                 <w:bCs/>
                 <w:i/>
@@ -1920,7 +1920,7 @@
             </w:r>
             <w:r>
               <w:rPr>
-                <w:rFonts w:ascii="Calibri" w:hAnsi="Calibri"/>
+                <w:rFonts w:ascii="Aktiv Grotesk" w:hAnsi="Aktiv Grotesk"/>
                 <w:b/>
                 <w:bCs/>
                 <w:i/>
@@ -1932,7 +1932,7 @@
             </w:r>
             <w:r>
               <w:rPr>
-                <w:rFonts w:ascii="Calibri" w:hAnsi="Calibri"/>
+                <w:rFonts w:ascii="Aktiv Grotesk" w:hAnsi="Aktiv Grotesk"/>
                 <w:b/>
                 <w:bCs/>
                 <w:i/>
@@ -1957,7 +1957,7 @@
             <w:pPr>
               <w:spacing w:after="160" w:line="259" w:lineRule="auto"/>
               <w:rPr>
-                <w:rFonts w:eastAsia="Calibri" w:cs="Calibri"/>
+                <w:rFonts w:eastAsia="Aktiv Grotesk" w:cs="Aktiv Grotesk"/>
                 <w:b/>
                 <w:bCs/>
                 <w:sz w:val="20"/>
@@ -1966,7 +1966,7 @@
             </w:pPr>
             <w:r>
               <w:rPr>
-                <w:rFonts w:eastAsia="Calibri" w:cs="Calibri"/>
+                <w:rFonts w:eastAsia="Aktiv Grotesk" w:cs="Aktiv Grotesk"/>
                 <w:b/>
                 <w:bCs/>
                 <w:sz w:val="20"/>
@@ -1976,7 +1976,7 @@
             </w:r>
             <w:r>
               <w:rPr>
-                <w:rFonts w:eastAsia="Calibri" w:cs="Calibri"/>
+                <w:rFonts w:eastAsia="Aktiv Grotesk" w:cs="Aktiv Grotesk"/>
                 <w:b/>
                 <w:bCs/>
                 <w:sz w:val="20"/>
@@ -2364,7 +2364,7 @@
             <w:pPr>
               <w:jc w:val="center"/>
               <w:rPr>
-                <w:rFonts w:ascii="Calibri" w:hAnsi="Calibri"/>
+                <w:rFonts w:ascii="Aktiv Grotesk" w:hAnsi="Aktiv Grotesk"/>
                 <w:b/>
                 <w:bCs/>
                 <w:i/>
@@ -2375,7 +2375,7 @@
             </w:pPr>
             <w:r>
               <w:rPr>
-                <w:rFonts w:ascii="Calibri" w:hAnsi="Calibri"/>
+                <w:rFonts w:ascii="Aktiv Grotesk" w:hAnsi="Aktiv Grotesk"/>
                 <w:b/>
                 <w:bCs/>
                 <w:i/>
@@ -2387,7 +2387,7 @@
             </w:r>
             <w:r>
               <w:rPr>
-                <w:rFonts w:ascii="Calibri" w:hAnsi="Calibri"/>
+                <w:rFonts w:ascii="Aktiv Grotesk" w:hAnsi="Aktiv Grotesk"/>
                 <w:b/>
                 <w:bCs/>
                 <w:i/>
@@ -2399,7 +2399,7 @@
             </w:r>
             <w:r>
               <w:rPr>
-                <w:rFonts w:ascii="Calibri" w:hAnsi="Calibri"/>
+                <w:rFonts w:ascii="Aktiv Grotesk" w:hAnsi="Aktiv Grotesk"/>
                 <w:b/>
                 <w:bCs/>
                 <w:i/>
@@ -2424,7 +2424,7 @@
             <w:pPr>
               <w:spacing w:after="160" w:line="259" w:lineRule="auto"/>
               <w:rPr>
-                <w:rFonts w:eastAsia="Calibri" w:cs="Calibri"/>
+                <w:rFonts w:eastAsia="Aktiv Grotesk" w:cs="Aktiv Grotesk"/>
                 <w:b/>
                 <w:bCs/>
                 <w:sz w:val="20"/>
@@ -2433,7 +2433,7 @@
             </w:pPr>
             <w:r>
               <w:rPr>
-                <w:rFonts w:eastAsia="Calibri" w:cs="Calibri"/>
+                <w:rFonts w:eastAsia="Aktiv Grotesk" w:cs="Aktiv Grotesk"/>
                 <w:b/>
                 <w:bCs/>
                 <w:sz w:val="20"/>
@@ -2443,7 +2443,7 @@
             </w:r>
             <w:r>
               <w:rPr>
-                <w:rFonts w:eastAsia="Calibri" w:cs="Calibri"/>
+                <w:rFonts w:eastAsia="Aktiv Grotesk" w:cs="Aktiv Grotesk"/>
                 <w:b/>
                 <w:bCs/>
                 <w:sz w:val="20"/>
@@ -2773,7 +2773,7 @@
             <w:pPr>
               <w:jc w:val="center"/>
               <w:rPr>
-                <w:rFonts w:ascii="Calibri" w:hAnsi="Calibri"/>
+                <w:rFonts w:ascii="Aktiv Grotesk" w:hAnsi="Aktiv Grotesk"/>
                 <w:b/>
                 <w:bCs/>
                 <w:i/>
@@ -2784,7 +2784,7 @@
             </w:pPr>
             <w:r>
               <w:rPr>
-                <w:rFonts w:ascii="Calibri" w:hAnsi="Calibri"/>
+                <w:rFonts w:ascii="Aktiv Grotesk" w:hAnsi="Aktiv Grotesk"/>
                 <w:b/>
                 <w:bCs/>
                 <w:i/>
@@ -2796,7 +2796,7 @@
             </w:r>
             <w:r>
               <w:rPr>
-                <w:rFonts w:ascii="Calibri" w:hAnsi="Calibri"/>
+                <w:rFonts w:ascii="Aktiv Grotesk" w:hAnsi="Aktiv Grotesk"/>
                 <w:b/>
                 <w:bCs/>
                 <w:i/>
@@ -2808,7 +2808,7 @@
             </w:r>
             <w:r>
               <w:rPr>
-                <w:rFonts w:ascii="Calibri" w:hAnsi="Calibri"/>
+                <w:rFonts w:ascii="Aktiv Grotesk" w:hAnsi="Aktiv Grotesk"/>
                 <w:b/>
                 <w:bCs/>
                 <w:i/>
@@ -2820,7 +2820,7 @@
             </w:r>
             <w:r>
               <w:rPr>
-                <w:rFonts w:ascii="Calibri" w:hAnsi="Calibri"/>
+                <w:rFonts w:ascii="Aktiv Grotesk" w:hAnsi="Aktiv Grotesk"/>
                 <w:b/>
                 <w:bCs/>
                 <w:i/>
@@ -2845,7 +2845,7 @@
             <w:pPr>
               <w:spacing w:after="160" w:line="259" w:lineRule="auto"/>
               <w:rPr>
-                <w:rFonts w:eastAsia="Calibri" w:cs="Calibri"/>
+                <w:rFonts w:eastAsia="Aktiv Grotesk" w:cs="Aktiv Grotesk"/>
                 <w:b/>
                 <w:bCs/>
                 <w:sz w:val="20"/>
@@ -2854,7 +2854,7 @@
             </w:pPr>
             <w:r>
               <w:rPr>
-                <w:rFonts w:eastAsia="Calibri" w:cs="Calibri"/>
+                <w:rFonts w:eastAsia="Aktiv Grotesk" w:cs="Aktiv Grotesk"/>
                 <w:b/>
                 <w:bCs/>
                 <w:sz w:val="20"/>
@@ -2864,7 +2864,7 @@
             </w:r>
             <w:r>
               <w:rPr>
-                <w:rFonts w:eastAsia="Calibri" w:cs="Calibri"/>
+                <w:rFonts w:eastAsia="Aktiv Grotesk" w:cs="Aktiv Grotesk"/>
                 <w:b/>
                 <w:bCs/>
                 <w:sz w:val="20"/>
@@ -3163,7 +3163,7 @@
             <w:pPr>
               <w:jc w:val="center"/>
               <w:rPr>
-                <w:rFonts w:ascii="Calibri" w:hAnsi="Calibri"/>
+                <w:rFonts w:ascii="Aktiv Grotesk" w:hAnsi="Aktiv Grotesk"/>
                 <w:b/>
                 <w:bCs/>
                 <w:i/>
@@ -3174,7 +3174,7 @@
             </w:pPr>
             <w:r>
               <w:rPr>
-                <w:rFonts w:ascii="Calibri" w:hAnsi="Calibri"/>
+                <w:rFonts w:ascii="Aktiv Grotesk" w:hAnsi="Aktiv Grotesk"/>
                 <w:b/>
                 <w:bCs/>
                 <w:i/>
@@ -3187,7 +3187,7 @@
             </w:r>
             <w:r>
               <w:rPr>
-                <w:rFonts w:ascii="Calibri" w:hAnsi="Calibri"/>
+                <w:rFonts w:ascii="Aktiv Grotesk" w:hAnsi="Aktiv Grotesk"/>
                 <w:b/>
                 <w:bCs/>
                 <w:i/>
@@ -3199,7 +3199,7 @@
             </w:r>
             <w:r>
               <w:rPr>
-                <w:rFonts w:ascii="Calibri" w:hAnsi="Calibri"/>
+                <w:rFonts w:ascii="Aktiv Grotesk" w:hAnsi="Aktiv Grotesk"/>
                 <w:b/>
                 <w:bCs/>
                 <w:i/>
@@ -3224,7 +3224,7 @@
             <w:pPr>
               <w:spacing w:after="160" w:line="259" w:lineRule="auto"/>
               <w:rPr>
-                <w:rFonts w:eastAsia="Calibri" w:cs="Calibri"/>
+                <w:rFonts w:eastAsia="Aktiv Grotesk" w:cs="Aktiv Grotesk"/>
                 <w:b/>
                 <w:bCs/>
                 <w:sz w:val="20"/>
@@ -3233,7 +3233,7 @@
             </w:pPr>
             <w:r>
               <w:rPr>
-                <w:rFonts w:eastAsia="Calibri" w:cs="Calibri"/>
+                <w:rFonts w:eastAsia="Aktiv Grotesk" w:cs="Aktiv Grotesk"/>
                 <w:b/>
                 <w:bCs/>
                 <w:sz w:val="20"/>
@@ -3243,7 +3243,7 @@
             </w:r>
             <w:r>
               <w:rPr>
-                <w:rFonts w:eastAsia="Calibri" w:cs="Calibri"/>
+                <w:rFonts w:eastAsia="Aktiv Grotesk" w:cs="Aktiv Grotesk"/>
                 <w:b/>
                 <w:bCs/>
                 <w:sz w:val="20"/>
@@ -3253,7 +3253,7 @@
             </w:r>
             <w:r>
               <w:rPr>
-                <w:rFonts w:eastAsia="Calibri" w:cs="Calibri"/>
+                <w:rFonts w:eastAsia="Aktiv Grotesk" w:cs="Aktiv Grotesk"/>
                 <w:b/>
                 <w:bCs/>
                 <w:sz w:val="20"/>
@@ -3514,7 +3514,7 @@
             <w:pPr>
               <w:jc w:val="center"/>
               <w:rPr>
-                <w:rFonts w:ascii="Calibri" w:hAnsi="Calibri"/>
+                <w:rFonts w:ascii="Aktiv Grotesk" w:hAnsi="Aktiv Grotesk"/>
                 <w:b/>
                 <w:bCs/>
                 <w:i/>
@@ -3525,7 +3525,7 @@
             </w:pPr>
             <w:r>
               <w:rPr>
-                <w:rFonts w:ascii="Calibri" w:hAnsi="Calibri"/>
+                <w:rFonts w:ascii="Aktiv Grotesk" w:hAnsi="Aktiv Grotesk"/>
                 <w:b/>
                 <w:bCs/>
                 <w:i/>
@@ -3537,7 +3537,7 @@
             </w:r>
             <w:r>
               <w:rPr>
-                <w:rFonts w:ascii="Calibri" w:hAnsi="Calibri"/>
+                <w:rFonts w:ascii="Aktiv Grotesk" w:hAnsi="Aktiv Grotesk"/>
                 <w:b/>
                 <w:bCs/>
                 <w:i/>
@@ -3549,7 +3549,7 @@
             </w:r>
             <w:r>
               <w:rPr>
-                <w:rFonts w:ascii="Calibri" w:hAnsi="Calibri"/>
+                <w:rFonts w:ascii="Aktiv Grotesk" w:hAnsi="Aktiv Grotesk"/>
                 <w:b/>
                 <w:bCs/>
                 <w:i/>
@@ -3561,7 +3561,7 @@
             </w:r>
             <w:r>
               <w:rPr>
-                <w:rFonts w:ascii="Calibri" w:hAnsi="Calibri"/>
+                <w:rFonts w:ascii="Aktiv Grotesk" w:hAnsi="Aktiv Grotesk"/>
                 <w:b/>
                 <w:bCs/>
                 <w:i/>
@@ -3586,7 +3586,7 @@
             <w:pPr>
               <w:spacing w:after="160" w:line="259" w:lineRule="auto"/>
               <w:rPr>
-                <w:rFonts w:eastAsia="Calibri" w:cs="Calibri"/>
+                <w:rFonts w:eastAsia="Aktiv Grotesk" w:cs="Aktiv Grotesk"/>
                 <w:b/>
                 <w:bCs/>
                 <w:sz w:val="20"/>
@@ -3595,7 +3595,7 @@
             </w:pPr>
             <w:r>
               <w:rPr>
-                <w:rFonts w:eastAsia="Calibri" w:cs="Calibri"/>
+                <w:rFonts w:eastAsia="Aktiv Grotesk" w:cs="Aktiv Grotesk"/>
                 <w:b/>
                 <w:bCs/>
                 <w:sz w:val="20"/>
@@ -3605,7 +3605,7 @@
             </w:r>
             <w:r>
               <w:rPr>
-                <w:rFonts w:eastAsia="Calibri" w:cs="Calibri"/>
+                <w:rFonts w:eastAsia="Aktiv Grotesk" w:cs="Aktiv Grotesk"/>
                 <w:b/>
                 <w:bCs/>
                 <w:sz w:val="20"/>
@@ -3615,7 +3615,7 @@
             </w:r>
             <w:r>
               <w:rPr>
-                <w:rFonts w:eastAsia="Calibri" w:cs="Calibri"/>
+                <w:rFonts w:eastAsia="Aktiv Grotesk" w:cs="Aktiv Grotesk"/>
                 <w:b/>
                 <w:bCs/>
                 <w:sz w:val="20"/>
@@ -3625,7 +3625,7 @@
             </w:r>
             <w:r>
               <w:rPr>
-                <w:rFonts w:eastAsia="Calibri" w:cs="Calibri"/>
+                <w:rFonts w:eastAsia="Aktiv Grotesk" w:cs="Aktiv Grotesk"/>
                 <w:b/>
                 <w:bCs/>
                 <w:sz w:val="20"/>
@@ -3636,7 +3636,7 @@
             <w:proofErr w:type="spellStart"/>
             <w:r>
               <w:rPr>
-                <w:rFonts w:eastAsia="Calibri" w:cs="Calibri"/>
+                <w:rFonts w:eastAsia="Aktiv Grotesk" w:cs="Aktiv Grotesk"/>
                 <w:b/>
                 <w:bCs/>
                 <w:sz w:val="20"/>
@@ -3647,7 +3647,7 @@
             <w:proofErr w:type="spellEnd"/>
             <w:r>
               <w:rPr>
-                <w:rFonts w:eastAsia="Calibri" w:cs="Calibri"/>
+                <w:rFonts w:eastAsia="Aktiv Grotesk" w:cs="Aktiv Grotesk"/>
                 <w:b/>
                 <w:bCs/>
                 <w:sz w:val="20"/>
@@ -3963,7 +3963,7 @@
             <w:pPr>
               <w:jc w:val="center"/>
               <w:rPr>
-                <w:rFonts w:ascii="Calibri" w:hAnsi="Calibri"/>
+                <w:rFonts w:ascii="Aktiv Grotesk" w:hAnsi="Aktiv Grotesk"/>
                 <w:b/>
                 <w:bCs/>
                 <w:i/>
@@ -3974,7 +3974,7 @@
             </w:pPr>
             <w:r>
               <w:rPr>
-                <w:rFonts w:ascii="Calibri" w:hAnsi="Calibri"/>
+                <w:rFonts w:ascii="Aktiv Grotesk" w:hAnsi="Aktiv Grotesk"/>
                 <w:b/>
                 <w:bCs/>
                 <w:i/>
@@ -3986,7 +3986,7 @@
             </w:r>
             <w:r>
               <w:rPr>
-                <w:rFonts w:ascii="Calibri" w:hAnsi="Calibri"/>
+                <w:rFonts w:ascii="Aktiv Grotesk" w:hAnsi="Aktiv Grotesk"/>
                 <w:b/>
                 <w:bCs/>
                 <w:i/>
@@ -3998,7 +3998,7 @@
             </w:r>
             <w:r>
               <w:rPr>
-                <w:rFonts w:ascii="Calibri" w:hAnsi="Calibri"/>
+                <w:rFonts w:ascii="Aktiv Grotesk" w:hAnsi="Aktiv Grotesk"/>
                 <w:b/>
                 <w:bCs/>
                 <w:i/>
@@ -4010,7 +4010,7 @@
             </w:r>
             <w:r>
               <w:rPr>
-                <w:rFonts w:ascii="Calibri" w:hAnsi="Calibri"/>
+                <w:rFonts w:ascii="Aktiv Grotesk" w:hAnsi="Aktiv Grotesk"/>
                 <w:b/>
                 <w:bCs/>
                 <w:i/>
@@ -4257,7 +4257,7 @@
             <w:pPr>
               <w:jc w:val="center"/>
               <w:rPr>
-                <w:rFonts w:ascii="Calibri" w:hAnsi="Calibri"/>
+                <w:rFonts w:ascii="Aktiv Grotesk" w:hAnsi="Aktiv Grotesk"/>
                 <w:b/>
                 <w:bCs/>
                 <w:i/>
@@ -4268,7 +4268,7 @@
             </w:pPr>
             <w:r>
               <w:rPr>
-                <w:rFonts w:ascii="Calibri" w:hAnsi="Calibri"/>
+                <w:rFonts w:ascii="Aktiv Grotesk" w:hAnsi="Aktiv Grotesk"/>
                 <w:b/>
                 <w:bCs/>
                 <w:i/>
@@ -4280,7 +4280,7 @@
             </w:r>
             <w:r>
               <w:rPr>
-                <w:rFonts w:ascii="Calibri" w:hAnsi="Calibri"/>
+                <w:rFonts w:ascii="Aktiv Grotesk" w:hAnsi="Aktiv Grotesk"/>
                 <w:b/>
                 <w:bCs/>
                 <w:i/>
@@ -4292,7 +4292,7 @@
             </w:r>
             <w:r>
               <w:rPr>
-                <w:rFonts w:ascii="Calibri" w:hAnsi="Calibri"/>
+                <w:rFonts w:ascii="Aktiv Grotesk" w:hAnsi="Aktiv Grotesk"/>
                 <w:b/>
                 <w:bCs/>
                 <w:i/>
@@ -4304,7 +4304,7 @@
             </w:r>
             <w:r>
               <w:rPr>
-                <w:rFonts w:ascii="Calibri" w:hAnsi="Calibri"/>
+                <w:rFonts w:ascii="Aktiv Grotesk" w:hAnsi="Aktiv Grotesk"/>
                 <w:b/>
                 <w:bCs/>
                 <w:i/>
@@ -7991,7 +7991,7 @@
       <w:contextualSpacing/>
     </w:pPr>
     <w:rPr>
-      <w:rFonts w:ascii="Calibri" w:eastAsiaTheme="minorHAnsi" w:hAnsi="Calibri" w:cs="Times New Roman"/>
+      <w:rFonts w:ascii="Aktiv Grotesk" w:eastAsiaTheme="minorHAnsi" w:hAnsi="Aktiv Grotesk" w:cs="Times New Roman"/>
       <w:sz w:val="22"/>
       <w:szCs w:val="22"/>
     </w:rPr>
@@ -8136,7 +8136,7 @@
     <w:basedOn w:val="Normal"/>
     <w:rsid w:val="00EF4828"/>
     <w:rPr>
-      <w:rFonts w:ascii="Calibri" w:eastAsiaTheme="minorHAnsi" w:hAnsi="Calibri" w:cs="Times New Roman"/>
+      <w:rFonts w:ascii="Aktiv Grotesk" w:eastAsiaTheme="minorHAnsi" w:hAnsi="Aktiv Grotesk" w:cs="Times New Roman"/>
       <w:sz w:val="17"/>
       <w:szCs w:val="17"/>
     </w:rPr>
@@ -8151,7 +8151,7 @@
       <w:spacing w:after="0" w:line="240" w:lineRule="auto"/>
     </w:pPr>
     <w:rPr>
-      <w:rFonts w:ascii="Arial" w:hAnsi="Arial"/>
+      <w:rFonts w:ascii="Aktiv Grotesk" w:hAnsi="Aktiv Grotesk"/>
       <w:sz w:val="20"/>
       <w:szCs w:val="20"/>
       <w:lang w:val="en-GB"/>
@@ -8244,7 +8244,7 @@
       <w:spacing w:after="0" w:line="240" w:lineRule="auto"/>
     </w:pPr>
     <w:rPr>
-      <w:rFonts w:ascii="Arial" w:hAnsi="Arial" w:cs="Arial"/>
+      <w:rFonts w:ascii="Aktiv Grotesk" w:hAnsi="Aktiv Grotesk" w:cs="Aktiv Grotesk"/>
       <w:color w:val="000000"/>
       <w:sz w:val="24"/>
       <w:szCs w:val="24"/>
@@ -8342,15 +8342,15 @@
         <a:font script="Uigh" typeface="Microsoft Uighur"/>
       </a:majorFont>
       <a:minorFont>
-        <a:latin typeface="Calibri"/>
+        <a:latin typeface="Aktiv Grotesk"/>
         <a:ea typeface=""/>
         <a:cs typeface=""/>
         <a:font script="Jpan" typeface="ＭＳ 明朝"/>
         <a:font script="Hang" typeface="맑은 고딕"/>
         <a:font script="Hans" typeface="宋体"/>
         <a:font script="Hant" typeface="新細明體"/>
-        <a:font script="Arab" typeface="Arial"/>
-        <a:font script="Hebr" typeface="Arial"/>
+        <a:font script="Arab" typeface="Aktiv Grotesk"/>
+        <a:font script="Hebr" typeface="Aktiv Grotesk"/>
         <a:font script="Thai" typeface="Cordia New"/>
         <a:font script="Ethi" typeface="Nyala"/>
         <a:font script="Beng" typeface="Vrinda"/>
@@ -8372,7 +8372,7 @@
         <a:font script="Laoo" typeface="DokChampa"/>
         <a:font script="Sinh" typeface="Iskoola Pota"/>
         <a:font script="Mong" typeface="Mongolian Baiti"/>
-        <a:font script="Viet" typeface="Arial"/>
+        <a:font script="Viet" typeface="Aktiv Grotesk"/>
         <a:font script="Uigh" typeface="Microsoft Uighur"/>
       </a:minorFont>
     </a:fontScheme>

</xml_diff>